<commit_message>
Implement re-upload for incomplete increment forms
</commit_message>
<xml_diff>
--- a/CooperativeDevelopment - Backend/src/main/resources/templates/increment/කාර්ය සාධක පරීක්ෂණ වාර්තා - ප්‍රධාන කළමනාකරණ සේවා නිලධාරි.docx
+++ b/CooperativeDevelopment - Backend/src/main/resources/templates/increment/කාර්ය සාධක පරීක්ෂණ වාර්තා - ප්‍රධාන කළමනාකරණ සේවා නිලධාරි.docx
@@ -155,10 +155,11 @@
           <w:bCs/>
           <w:u w:val="single"/>
         </w:rPr>
-        <w:t>සහකාර</w:t>
-      </w:r>
-      <w:r>
-        <w:rPr>
+        <w:t xml:space="preserve"> සේවා</w:t>
+      </w:r>
+      <w:r>
+        <w:rPr>
+          <w:rFonts w:ascii="Iskoola Pota" w:hAnsi="Iskoola Pota" w:cs="Iskoola Pota"/>
           <w:b/>
           <w:bCs/>
           <w:u w:val="single"/>
@@ -172,7 +173,7 @@
           <w:bCs/>
           <w:u w:val="single"/>
         </w:rPr>
-        <w:t>සේවය</w:t>
+        <w:t>නිලධාරී සේවය</w:t>
       </w:r>
     </w:p>
     <w:p>
@@ -623,11 +624,11 @@
           <w:sz w:val="22"/>
           <w:szCs w:val="22"/>
         </w:rPr>
-        <w:t>පිරීමෙන්</w:t>
-      </w:r>
-      <w:r>
-        <w:rPr>
-          <w:rFonts w:cstheme="minorHAnsi"/>
+        <w:t>පිරවීමෙන්</w:t>
+      </w:r>
+      <w:r>
+        <w:rPr>
+          <w:rFonts w:ascii="Iskoola Pota" w:hAnsi="Iskoola Pota" w:cs="Iskoola Pota"/>
           <w:sz w:val="22"/>
           <w:szCs w:val="22"/>
         </w:rPr>
@@ -879,10 +880,11 @@
           <w:sz w:val="22"/>
           <w:szCs w:val="22"/>
         </w:rPr>
-        <w:t>චේතනාන්විත</w:t>
-      </w:r>
-      <w:r>
-        <w:rPr>
+        <w:t>වේතනාධික</w:t>
+      </w:r>
+      <w:r>
+        <w:rPr>
+          <w:rFonts w:ascii="Iskoola Pota" w:hAnsi="Iskoola Pota" w:cs="Iskoola Pota"/>
           <w:sz w:val="22"/>
           <w:szCs w:val="22"/>
         </w:rPr>
@@ -8213,6 +8215,46 @@
     </w:p>
     <w:p>
       <w:pPr>
+        <w:rPr>
+          <w:b/>
+          <w:bCs/>
+        </w:rPr>
+      </w:pPr>
+    </w:p>
+    <w:p>
+      <w:pPr>
+        <w:rPr>
+          <w:b/>
+          <w:bCs/>
+        </w:rPr>
+      </w:pPr>
+    </w:p>
+    <w:p>
+      <w:pPr>
+        <w:rPr>
+          <w:b/>
+          <w:bCs/>
+        </w:rPr>
+      </w:pPr>
+    </w:p>
+    <w:p>
+      <w:pPr>
+        <w:rPr>
+          <w:b/>
+          <w:bCs/>
+        </w:rPr>
+      </w:pPr>
+    </w:p>
+    <w:p>
+      <w:pPr>
+        <w:rPr>
+          <w:b/>
+          <w:bCs/>
+        </w:rPr>
+      </w:pPr>
+    </w:p>
+    <w:p>
+      <w:pPr>
         <w:jc w:val="center"/>
         <w:rPr>
           <w:b/>
@@ -10986,6 +11028,14 @@
         </w:tc>
       </w:tr>
     </w:tbl>
+    <w:p>
+      <w:pPr>
+        <w:rPr>
+          <w:b/>
+          <w:bCs/>
+        </w:rPr>
+      </w:pPr>
+    </w:p>
     <w:p>
       <w:pPr>
         <w:rPr>
@@ -16079,6 +16129,7 @@
   <w:style w:type="character" w:default="1" w:styleId="DefaultParagraphFont">
     <w:name w:val="Default Paragraph Font"/>
     <w:uiPriority w:val="1"/>
+    <w:semiHidden/>
     <w:unhideWhenUsed/>
   </w:style>
   <w:style w:type="table" w:default="1" w:styleId="TableNormal">

</xml_diff>